<commit_message>
dev and test progress fall 2026
</commit_message>
<xml_diff>
--- a/doc/thinking process.docx
+++ b/doc/thinking process.docx
@@ -110,15 +110,43 @@
     </w:p>
     <w:p>
       <w:r>
-        <w:t xml:space="preserve">Future ideas – keywords </w:t>
-      </w:r>
-      <w:proofErr w:type="gramStart"/>
-      <w:r>
-        <w:t>( and</w:t>
-      </w:r>
-      <w:proofErr w:type="gramEnd"/>
-      <w:r>
-        <w:t xml:space="preserve"> or real complex integer positive …)</w:t>
+        <w:t>Future ideas – keywords ( and</w:t>
+      </w:r>
+      <w:r>
+        <w:t>,</w:t>
+      </w:r>
+      <w:r>
+        <w:t xml:space="preserve"> or</w:t>
+      </w:r>
+      <w:r>
+        <w:t>,</w:t>
+      </w:r>
+      <w:r>
+        <w:t xml:space="preserve"> real</w:t>
+      </w:r>
+      <w:r>
+        <w:t>,</w:t>
+      </w:r>
+      <w:r>
+        <w:t xml:space="preserve"> complex</w:t>
+      </w:r>
+      <w:r>
+        <w:t>,</w:t>
+      </w:r>
+      <w:r>
+        <w:t xml:space="preserve"> integer</w:t>
+      </w:r>
+      <w:r>
+        <w:t>,</w:t>
+      </w:r>
+      <w:r>
+        <w:t xml:space="preserve"> positive</w:t>
+      </w:r>
+      <w:r>
+        <w:t>,</w:t>
+      </w:r>
+      <w:r>
+        <w:t xml:space="preserve"> …)</w:t>
       </w:r>
     </w:p>
     <w:p/>
@@ -204,7 +232,7 @@
         <w:rPr>
           <w:color w:val="4EA72E" w:themeColor="accent6"/>
         </w:rPr>
-        <w:t>2 forbidden consecutive relational operators</w:t>
+        <w:t>string starts or ends with relational</w:t>
       </w:r>
     </w:p>
     <w:p>
@@ -222,7 +250,7 @@
         <w:rPr>
           <w:color w:val="4EA72E" w:themeColor="accent6"/>
         </w:rPr>
-        <w:t>non-supported characters</w:t>
+        <w:t>2 forbidden consecutive relational operators</w:t>
       </w:r>
     </w:p>
     <w:p>
@@ -240,49 +268,7 @@
         <w:rPr>
           <w:color w:val="4EA72E" w:themeColor="accent6"/>
         </w:rPr>
-        <w:t xml:space="preserve">alpha groups are </w:t>
-      </w:r>
-      <w:proofErr w:type="gramStart"/>
-      <w:r>
-        <w:rPr>
-          <w:color w:val="4EA72E" w:themeColor="accent6"/>
-        </w:rPr>
-        <w:t>interrupted  (</w:t>
-      </w:r>
-      <w:proofErr w:type="gramEnd"/>
-      <w:r>
-        <w:rPr>
-          <w:color w:val="4EA72E" w:themeColor="accent6"/>
-        </w:rPr>
-        <w:t>e.g. '</w:t>
-      </w:r>
-      <w:proofErr w:type="spellStart"/>
-      <w:r>
-        <w:rPr>
-          <w:color w:val="4EA72E" w:themeColor="accent6"/>
-        </w:rPr>
-        <w:t>x23y</w:t>
-      </w:r>
-      <w:proofErr w:type="spellEnd"/>
-      <w:r>
-        <w:rPr>
-          <w:color w:val="4EA72E" w:themeColor="accent6"/>
-        </w:rPr>
-        <w:t>') (strings like '</w:t>
-      </w:r>
-      <w:proofErr w:type="spellStart"/>
-      <w:r>
-        <w:rPr>
-          <w:color w:val="4EA72E" w:themeColor="accent6"/>
-        </w:rPr>
-        <w:t>x1</w:t>
-      </w:r>
-      <w:proofErr w:type="spellEnd"/>
-      <w:r>
-        <w:rPr>
-          <w:color w:val="4EA72E" w:themeColor="accent6"/>
-        </w:rPr>
-        <w:t>' will be allowed as a subscript typo)</w:t>
+        <w:t>non-supported characters</w:t>
       </w:r>
     </w:p>
     <w:p>
@@ -300,16 +286,8 @@
         <w:rPr>
           <w:color w:val="4EA72E" w:themeColor="accent6"/>
         </w:rPr>
-        <w:t xml:space="preserve">limit exceeded for consecutive letters not in </w:t>
-      </w:r>
-      <w:proofErr w:type="spellStart"/>
-      <w:r>
-        <w:rPr>
-          <w:color w:val="4EA72E" w:themeColor="accent6"/>
-        </w:rPr>
-        <w:t>funcs</w:t>
-      </w:r>
-      <w:proofErr w:type="spellEnd"/>
+        <w:t>limit exceeded for consecutive letters not in funcs</w:t>
+      </w:r>
     </w:p>
     <w:p>
       <w:pPr>
@@ -326,7 +304,6 @@
         <w:rPr>
           <w:color w:val="4EA72E" w:themeColor="accent6"/>
         </w:rPr>
-        <w:lastRenderedPageBreak/>
         <w:t>any sort of bad placement of characters ('_', ',', '.', ';', '\'', '`', '&amp;')</w:t>
       </w:r>
       <w:r>
@@ -349,13 +326,94 @@
           <w:ilvl w:val="0"/>
           <w:numId w:val="1"/>
         </w:numPr>
-      </w:pPr>
-      <w:r>
+        <w:rPr>
+          <w:color w:val="4EA72E" w:themeColor="accent6"/>
+        </w:rPr>
+      </w:pPr>
+      <w:r>
+        <w:rPr>
+          <w:color w:val="4EA72E" w:themeColor="accent6"/>
+        </w:rPr>
+        <w:lastRenderedPageBreak/>
         <w:t>functions have invalid content</w:t>
       </w:r>
-      <w:r>
-        <w:t xml:space="preserve"> (first testing)</w:t>
-      </w:r>
+    </w:p>
+    <w:p>
+      <w:pPr>
+        <w:pStyle w:val="ListParagraph"/>
+        <w:numPr>
+          <w:ilvl w:val="0"/>
+          <w:numId w:val="1"/>
+        </w:numPr>
+      </w:pPr>
+      <w:r>
+        <w:t>incorrect character order</w:t>
+      </w:r>
+      <w:r>
+        <w:t xml:space="preserve"> (e.g. ‘x23y’, ‘x+=3’) – working on generating round robin tests</w:t>
+      </w:r>
+    </w:p>
+    <w:p>
+      <w:pPr>
+        <w:pStyle w:val="ListParagraph"/>
+        <w:numPr>
+          <w:ilvl w:val="0"/>
+          <w:numId w:val="1"/>
+        </w:numPr>
+      </w:pPr>
+      <w:r>
+        <w:t xml:space="preserve">[new function?] does the string respect the syntax definition i.e. curly brackets for constraints, square brackets for vectors, round brackets for order of operations or function specification (NOTE:  </w:t>
+      </w:r>
+      <w:r>
+        <w:t xml:space="preserve">we need to check that the </w:t>
+      </w:r>
+      <w:r>
+        <w:rPr>
+          <w:b/>
+          <w:bCs/>
+        </w:rPr>
+        <w:t>vectors are defined correctly</w:t>
+      </w:r>
+      <w:r>
+        <w:t xml:space="preserve">, </w:t>
+      </w:r>
+      <w:r>
+        <w:rPr>
+          <w:b/>
+          <w:bCs/>
+        </w:rPr>
+        <w:t>the curly brackets are at the end</w:t>
+      </w:r>
+      <w:r>
+        <w:t xml:space="preserve">, </w:t>
+      </w:r>
+      <w:r>
+        <w:rPr>
+          <w:b/>
+          <w:bCs/>
+        </w:rPr>
+        <w:t>curly and square brackets are not used for order of operation or randomly in the string</w:t>
+      </w:r>
+      <w:r>
+        <w:t xml:space="preserve"> </w:t>
+      </w:r>
+      <w:r>
+        <w:t>)</w:t>
+      </w:r>
+      <w:r>
+        <w:t xml:space="preserve"> (NOTE 2: Check for each round parenthesis that the content is an equation i.e. it does not end with sign etc, take each condition from the main function but don’t be redundant)</w:t>
+      </w:r>
+      <w:r>
+        <w:t xml:space="preserve"> (NOTE 3: The parenthesis should be treated as a standalone term, exclude cases like ‘(…)4.2’)</w:t>
+      </w:r>
+    </w:p>
+    <w:p>
+      <w:pPr>
+        <w:pStyle w:val="ListParagraph"/>
+        <w:rPr>
+          <w:color w:val="4EA72E" w:themeColor="accent6"/>
+        </w:rPr>
+      </w:pPr>
     </w:p>
     <w:p/>
     <w:p/>

</xml_diff>